<commit_message>
fix: refocus resume on academic foundation
</commit_message>
<xml_diff>
--- a/resume/李鑫-简历-公开版.docx
+++ b/resume/李鑫-简历-公开版.docx
@@ -106,7 +106,7 @@
           <w:color w:val="17365D"/>
           <w:sz w:val="24"/>
         </w:rPr>
-        <w:t>个人概要</w:t>
+        <w:t>专业学习</w:t>
       </w:r>
     </w:p>
     <w:p>
@@ -122,7 +122,7 @@
           <w:color w:val="111111"/>
           <w:sz w:val="18"/>
         </w:rPr>
-        <w:t>聚焦 AI 应用与桌面端产品开发，具有 Electron 交互、会话状态可靠性、本地数据安全与教学技能工程经验。能从用户问题定位根因，通过自动化测试、CI 与真机走查完成交付。</w:t>
+        <w:t>本科阶段依托东北大学计算机科学与工程学院课程与实验训练，系统学习计算机组成原理（92）、离散数学（94）、编译原理（88）、操作系统（88）、计算机网络与数据库原理；完成路由配置、VLAN 通信、高级交换机配置和小型校园网搭建等实践。</w:t>
       </w:r>
     </w:p>
     <w:p>
@@ -415,7 +415,7 @@
           <w:color w:val="111111"/>
           <w:sz w:val="18"/>
         </w:rPr>
-        <w:t>在 bohe-ai-consultation 与 juxiang-skills 累计合并 75 个个人 PR。修复会话谱系重启丢失与 SSE 重连吞事件问题，增加本地持久化、LRU 上限、坏文件容错和回归测试；另处理并发 429、会话中毒恢复和跨线程交互串台。</w:t>
+        <w:t>围绕桌面端会话可靠性，修复会话谱系重启丢失与 SSE 重连吞事件问题，增加本地持久化、LRU 上限、坏文件容错和回归测试；另处理并发 429、会话中毒恢复和跨线程交互串台。</w:t>
       </w:r>
     </w:p>
     <w:p>

</xml_diff>